<commit_message>
English literature reviews 11-15 and 17 (translated and fidelity-reviewed)
Causality and chaos, inverse problems with neural operators, belief updating,
optimal experimental design, goal-oriented OED in coastal aquifers, optimal RCT.

Co-Authored-By: Claude Opus 5.5 <noreply@anthropic.com>
Claude-Session: https://claude.ai/code/session_016Cdcj2FTAQGBVsJUyYJR2M
</commit_message>
<xml_diff>
--- a/docs/literature/Literature_review_Goal-Oriented_OED_Coastal_Aquifers.docx
+++ b/docs/literature/Literature_review_Goal-Oriented_OED_Coastal_Aquifers.docx
@@ -1409,7 +1409,7 @@
         <w:jc w:val="both"/>
       </w:pPr>
       <w:r>
-        <w:t xml:space="preserve">The position of the toe of the wedge follows where </w:t>
+        <w:t xml:space="preserve">The position of the toe of the wedge is obtained where </w:t>
       </w:r>
       <m:oMath>
         <m:r>
@@ -4438,7 +4438,7 @@
         <w:jc w:val="both"/>
       </w:pPr>
       <w:r>
-        <w:t xml:space="preserve">For one goal, reweighting the ensemble directly gives the posterior distribution of </w:t>
+        <w:t xml:space="preserve">For a given goal, reweighting the ensemble directly gives the posterior distribution of </w:t>
       </w:r>
       <m:oMath>
         <m:r>
@@ -4475,7 +4475,7 @@
         <w:jc w:val="both"/>
       </w:pPr>
       <w:r>
-        <w:t xml:space="preserve">Seawater conducts about 100 times more than freshwater, so electrical and electromagnetic methods (ERT, TDEM, AEM) are the main tools for the interface. Archie's law [B9] links the formation conductivity to the pore-water conductivity, and the chain rule turns geophysical sensitivity into sensitivity to salinity:</w:t>
+        <w:t xml:space="preserve">Seawater is about 100 times more conductive than freshwater, so electrical and electromagnetic methods (ERT, TDEM, AEM) are the main tools for the interface. Archie's law [B9] links the formation conductivity to the pore-water conductivity, and the chain rule turns geophysical sensitivity into sensitivity to salinity:</w:t>
       </w:r>
     </w:p>
     <w:p>
@@ -5463,7 +5463,7 @@
         </m:sSub>
       </m:oMath>
       <w:r>
-        <w:t xml:space="preserve"> directly free </w:t>
+        <w:t xml:space="preserve"> directly free up a margin of </w:t>
       </w:r>
       <m:oMath>
         <m:sSup>
@@ -5526,7 +5526,7 @@
         </m:sSub>
       </m:oMath>
       <w:r>
-        <w:t xml:space="preserve"> of room for pumping. Risk thus enters management, but not yet the design criterion.</w:t>
+        <w:t xml:space="preserve"> for pumping. Risk thus enters management, but not yet the design criterion.</w:t>
       </w:r>
     </w:p>
     <w:p>
@@ -8456,7 +8456,7 @@
             <w:vAlign w:val="top"/>
           </w:tcPr>
           <w:p>
-            <w:hyperlink w:history="1" r:id="rIdtbpum_dveyehjudwgbzqo">
+            <w:hyperlink w:history="1" r:id="rIda3vfc8wpkomu2w1uo0kk_">
               <w:r>
                 <w:rPr>
                   <w:color w:val="1D4ED8"/>
@@ -9790,7 +9790,7 @@
             <w:vAlign w:val="top"/>
           </w:tcPr>
           <w:p>
-            <w:hyperlink w:history="1" r:id="rId-zpypsbpjourswghvnq3r">
+            <w:hyperlink w:history="1" r:id="rIdxqiqf5o5blqdl4ayxibvr">
               <w:r>
                 <w:rPr>
                   <w:color w:val="1D4ED8"/>
@@ -10988,7 +10988,7 @@
             <w:vAlign w:val="top"/>
           </w:tcPr>
           <w:p>
-            <w:hyperlink w:history="1" r:id="rIdrfskytna99zih0seklpl9">
+            <w:hyperlink w:history="1" r:id="rIddf_vnkjgwcqqi2wgl9vdt">
               <w:r>
                 <w:rPr>
                   <w:color w:val="1D4ED8"/>
@@ -12029,7 +12029,7 @@
         <w:t xml:space="preserve">Link to the theoretical introduction. </w:t>
       </w:r>
       <w:r>
-        <w:t xml:space="preserve">Complements Sections 1.4 and 1.10. The concentration entropy is linked to the EIG: for noise-free measurements, the mutual information between measurements and parameters is exactly the entropy of the measurements. The key difference from the project is that there is no goal here: the uncertainty of the measurement is maximized, not the information about the quantity that decides.</w:t>
+        <w:t xml:space="preserve">Complements Sections 1.4 and 1.10. The concentration entropy is linked to the EIG: for noise-free measurements, the mutual information between measurements and parameters is exactly the entropy of the measurements. The key difference from the project is that there is no goal here: the uncertainty of the measurement is maximized, not the information about the quantity that drives the decision.</w:t>
       </w:r>
     </w:p>
     <w:p>
@@ -12232,7 +12232,7 @@
             <w:vAlign w:val="top"/>
           </w:tcPr>
           <w:p>
-            <w:hyperlink w:history="1" r:id="rIdwkysyakthr_kp4zea6zyq">
+            <w:hyperlink w:history="1" r:id="rIdyenkd8qclw3zxmq-jhana">
               <w:r>
                 <w:rPr>
                   <w:color w:val="1D4ED8"/>
@@ -13163,7 +13163,7 @@
             <w:vAlign w:val="top"/>
           </w:tcPr>
           <w:p>
-            <w:hyperlink w:history="1" r:id="rIdrhdvm1lysdxqrwsydxrl1">
+            <w:hyperlink w:history="1" r:id="rIddiyp_x6vetox81fprszcb">
               <w:r>
                 <w:rPr>
                   <w:color w:val="1D4ED8"/>
@@ -14204,7 +14204,7 @@
             <w:vAlign w:val="top"/>
           </w:tcPr>
           <w:p>
-            <w:hyperlink w:history="1" r:id="rId2l3q5twwggynlluwqkmsq">
+            <w:hyperlink w:history="1" r:id="rIddalldfzbwrrxo3mavfeow">
               <w:r>
                 <w:rPr>
                   <w:color w:val="1D4ED8"/>
@@ -15587,7 +15587,7 @@
             <w:vAlign w:val="top"/>
           </w:tcPr>
           <w:p>
-            <w:hyperlink w:history="1" r:id="rId_ljk4u-3qg8yytvqza_kx">
+            <w:hyperlink w:history="1" r:id="rId6zx5khq7ftmgc_oyqk39w">
               <w:r>
                 <w:rPr>
                   <w:color w:val="1D4ED8"/>
@@ -16819,7 +16819,7 @@
             <w:vAlign w:val="top"/>
           </w:tcPr>
           <w:p>
-            <w:hyperlink w:history="1" r:id="rIdu0kimukfxgrr6a14eaztl">
+            <w:hyperlink w:history="1" r:id="rIdma4uec01skftd-jpejxly">
               <w:r>
                 <w:rPr>
                   <w:color w:val="1D4ED8"/>
@@ -18355,7 +18355,7 @@
             <w:vAlign w:val="top"/>
           </w:tcPr>
           <w:p>
-            <w:hyperlink w:history="1" r:id="rIdntbibtk-pxktxte-6vhdm">
+            <w:hyperlink w:history="1" r:id="rIdsabsi9zqhefrvdb1vrzyq">
               <w:r>
                 <w:rPr>
                   <w:color w:val="1D4ED8"/>
@@ -18546,7 +18546,7 @@
         <w:t xml:space="preserve">Summary. </w:t>
       </w:r>
       <w:r>
-        <w:t xml:space="preserve">Traditional value-of-information analyses assume a single model with given parameters, which can bias the predictions and underestimate the uncertainty. The article places data-worth analysis within Bayesian model averaging: it describes theoretically the full BMA and the maximum likelihood version (MLBMA), in which the models are weighted with an information criterion computed at the maximum likelihood estimates. The worth of future data is measured as the expected reduction of the uncertainty of the BMA prediction, averaged over the possible values of the data before they are collected. MLBMA is applied to a synthetic example, with and without linearization.</w:t>
+        <w:t xml:space="preserve">Traditional value-of-information analyses assume a single model with given parameters, which can bias the predictions and underestimate the uncertainty. The article places data-worth analysis within Bayesian model averaging: it gives a theoretical description of the full BMA and of the maximum likelihood version (MLBMA), in which the models are weighted with an information criterion computed at the maximum likelihood estimates. The worth of future data is measured as the expected reduction of the uncertainty of the BMA prediction, averaged over the possible values of the data before they are collected. MLBMA is applied to a synthetic example, with and without linearization.</w:t>
       </w:r>
     </w:p>
     <w:p>
@@ -19555,7 +19555,7 @@
             <w:vAlign w:val="top"/>
           </w:tcPr>
           <w:p>
-            <w:hyperlink w:history="1" r:id="rIdwi4xymttckinyfatmyssb">
+            <w:hyperlink w:history="1" r:id="rIdfuklzsvcqk4dz2dc72l_f">
               <w:r>
                 <w:rPr>
                   <w:color w:val="1D4ED8"/>
@@ -20776,7 +20776,7 @@
             <w:vAlign w:val="top"/>
           </w:tcPr>
           <w:p>
-            <w:hyperlink w:history="1" r:id="rIdrcqknf_o_reoilrzc7475">
+            <w:hyperlink w:history="1" r:id="rIdnh7f3kcf0myvzwdhd3hd0">
               <w:r>
                 <w:rPr>
                   <w:color w:val="1D4ED8"/>
@@ -22139,7 +22139,7 @@
             <w:vAlign w:val="top"/>
           </w:tcPr>
           <w:p>
-            <w:hyperlink w:history="1" r:id="rId96y3r2cuad8jzc_br9n0v">
+            <w:hyperlink w:history="1" r:id="rIdtarcubmhrpgtnwrbqqrhn">
               <w:r>
                 <w:rPr>
                   <w:color w:val="1D4ED8"/>
@@ -23443,7 +23443,7 @@
             <w:vAlign w:val="top"/>
           </w:tcPr>
           <w:p>
-            <w:hyperlink w:history="1" r:id="rIdjh_ztutirbnzu627t4btj">
+            <w:hyperlink w:history="1" r:id="rIdnkofazz1bq9iyysklgojl">
               <w:r>
                 <w:rPr>
                   <w:color w:val="1D4ED8"/>
@@ -24624,7 +24624,7 @@
             <w:vAlign w:val="top"/>
           </w:tcPr>
           <w:p>
-            <w:hyperlink w:history="1" r:id="rIdynmidzeummdxpx4uy_hqa">
+            <w:hyperlink w:history="1" r:id="rIdgah3cyp0bfwgmlsgb89mr">
               <w:r>
                 <w:rPr>
                   <w:color w:val="1D4ED8"/>
@@ -26195,7 +26195,7 @@
             <w:vAlign w:val="top"/>
           </w:tcPr>
           <w:p>
-            <w:hyperlink w:history="1" r:id="rIdkpbvjimhfpdrxqpk2hiuj">
+            <w:hyperlink w:history="1" r:id="rIdsnwtri1taizs9qo59wrsa">
               <w:r>
                 <w:rPr>
                   <w:color w:val="1D4ED8"/>
@@ -27637,7 +27637,7 @@
             <w:vAlign w:val="top"/>
           </w:tcPr>
           <w:p>
-            <w:hyperlink w:history="1" r:id="rId-0lbcc27prpzjjdio_2y-">
+            <w:hyperlink w:history="1" r:id="rId8jncagi4uuy4os42gvgvd">
               <w:r>
                 <w:rPr>
                   <w:color w:val="1D4ED8"/>
@@ -28816,7 +28816,7 @@
         </m:sSub>
       </m:oMath>
       <w:r>
-        <w:t xml:space="preserve"> is a threshold goal over several zones (the wells), exactly the case of Theorem 2 of Section 9. For the project, the posterior ensemble conditioned on monitoring makes natural the question that the article does not ask: which observations most reduce the uncertainty of </w:t>
+        <w:t xml:space="preserve"> is a threshold goal over several zones (the wells), exactly the case of Theorem 2 of Section 9. For the project, the posterior ensemble conditioned on monitoring naturally raises the question that the article does not ask: which observations most reduce the uncertainty of </w:t>
       </w:r>
       <m:oMath>
         <m:sSub>
@@ -29036,7 +29036,7 @@
             <w:vAlign w:val="top"/>
           </w:tcPr>
           <w:p>
-            <w:hyperlink w:history="1" r:id="rIdsj_ixrqsx9rjobg05oe66">
+            <w:hyperlink w:history="1" r:id="rIdnhut6cujr6zrse6grzyla">
               <w:r>
                 <w:rPr>
                   <w:color w:val="1D4ED8"/>
@@ -30040,7 +30040,7 @@
             <w:vAlign w:val="top"/>
           </w:tcPr>
           <w:p>
-            <w:hyperlink w:history="1" r:id="rId7k2tzkisuhjrfsagm97wr">
+            <w:hyperlink w:history="1" r:id="rIduqd3o576zb4maqujyx7qz">
               <w:r>
                 <w:rPr>
                   <w:color w:val="1D4ED8"/>
@@ -31179,7 +31179,7 @@
             <w:vAlign w:val="top"/>
           </w:tcPr>
           <w:p>
-            <w:hyperlink w:history="1" r:id="rIdex43nduouxlyt4e_mswjy">
+            <w:hyperlink w:history="1" r:id="rIdqviid9dy3leoiqt_oz4m0">
               <w:r>
                 <w:rPr>
                   <w:color w:val="1D4ED8"/>
@@ -32220,7 +32220,7 @@
             <w:vAlign w:val="top"/>
           </w:tcPr>
           <w:p>
-            <w:hyperlink w:history="1" r:id="rIdmqm7nhhrozcnrvxlw5kgf">
+            <w:hyperlink w:history="1" r:id="rIdrd8josh5khtngfr9mgua8">
               <w:r>
                 <w:rPr>
                   <w:color w:val="1D4ED8"/>
@@ -35047,7 +35047,7 @@
                 <w:sz w:val="17"/>
                 <w:szCs w:val="17"/>
               </w:rPr>
-              <w:t xml:space="preserve">Dipole–dipole in combination works.</w:t>
+              <w:t xml:space="preserve">Dipole–dipole works in combination.</w:t>
             </w:r>
           </w:p>
         </w:tc>
@@ -35511,7 +35511,7 @@
               </w:rPr>
               <w:t xml:space="preserve">, 46. </w:t>
             </w:r>
-            <w:hyperlink w:history="1" r:id="rIdnyeoo4z2ryjgcpqzatepw">
+            <w:hyperlink w:history="1" r:id="rIdnjjgbi7gvsoowcel8yoej">
               <w:r>
                 <w:rPr>
                   <w:color w:val="1D4ED8"/>
@@ -35608,7 +35608,7 @@
               </w:rPr>
               <w:t xml:space="preserve">, 50(8), 6828–6849. </w:t>
             </w:r>
-            <w:hyperlink w:history="1" r:id="rIdinxgknedrtvq57frfrh79">
+            <w:hyperlink w:history="1" r:id="rId5-qmm07sfrtj8hjch9mlg">
               <w:r>
                 <w:rPr>
                   <w:color w:val="1D4ED8"/>
@@ -35704,7 +35704,7 @@
               </w:rPr>
               <w:t xml:space="preserve">, 146(6). </w:t>
             </w:r>
-            <w:hyperlink w:history="1" r:id="rIdn8t76d3vl6pbfe0evbsms">
+            <w:hyperlink w:history="1" r:id="rIdkqhisplgvvtfaychsqlz6">
               <w:r>
                 <w:rPr>
                   <w:color w:val="1D4ED8"/>
@@ -38189,7 +38189,7 @@
         <w:jc w:val="both"/>
       </w:pPr>
       <w:r>
-        <w:t xml:space="preserve">We took two zones: A (cells 20–26) and B, coastal (36–43), with head measurements in 32 candidate wells and 3 wells per design (4 960 combinations, all computed). Theorem 1 was confirmed: for risk in one zone, the ranking by the threshold EIG matches the ranking by </w:t>
+        <w:t xml:space="preserve">We took two zones: A (cells 20–26) and the coastal zone B (36–43), with head measurements in 32 candidate wells and 3 wells per design (4 960 combinations, all computed). Theorem 1 was confirmed: for risk in one zone, the ranking by the threshold EIG matches the ranking by </w:t>
       </w:r>
       <m:oMath>
         <m:sSup>
@@ -39628,7 +39628,7 @@
         </w:rPr>
         <w:t xml:space="preserve"> </w:t>
       </w:r>
-      <w:hyperlink w:history="1" r:id="rId0h_vbb9zznqmuttxmgzls">
+      <w:hyperlink w:history="1" r:id="rIdkh-_ul06c0zirrwu0nu0h">
         <w:r>
           <w:rPr>
             <w:color w:val="1D4ED8"/>
@@ -39689,7 +39689,7 @@
         </w:rPr>
         <w:t xml:space="preserve"> </w:t>
       </w:r>
-      <w:hyperlink w:history="1" r:id="rIdq03urmuj8cskw7xpds56h">
+      <w:hyperlink w:history="1" r:id="rIdkol0-wyirneuihvuk7mpp">
         <w:r>
           <w:rPr>
             <w:color w:val="1D4ED8"/>
@@ -39750,7 +39750,7 @@
         </w:rPr>
         <w:t xml:space="preserve"> </w:t>
       </w:r>
-      <w:hyperlink w:history="1" r:id="rIdrumvmtpac1gsq-wa_0uv-">
+      <w:hyperlink w:history="1" r:id="rId6zzcshbea9hgpsoplrotc">
         <w:r>
           <w:rPr>
             <w:color w:val="1D4ED8"/>
@@ -39811,7 +39811,7 @@
         </w:rPr>
         <w:t xml:space="preserve"> </w:t>
       </w:r>
-      <w:hyperlink w:history="1" r:id="rIdcfna7mzasfnnehrodq7or">
+      <w:hyperlink w:history="1" r:id="rIdtooz2irdwa9jx0c1mtcnw">
         <w:r>
           <w:rPr>
             <w:color w:val="1D4ED8"/>
@@ -39872,7 +39872,7 @@
         </w:rPr>
         <w:t xml:space="preserve"> </w:t>
       </w:r>
-      <w:hyperlink w:history="1" r:id="rIds8n0_hgjva2tbpt4_eagm">
+      <w:hyperlink w:history="1" r:id="rIdgvfb9trxwap0v52tnjaia">
         <w:r>
           <w:rPr>
             <w:color w:val="1D4ED8"/>
@@ -39933,7 +39933,7 @@
         </w:rPr>
         <w:t xml:space="preserve"> </w:t>
       </w:r>
-      <w:hyperlink w:history="1" r:id="rId6ehvufmwy20hc0aoegpaq">
+      <w:hyperlink w:history="1" r:id="rIdb5zig8h-2ndnxlfct5cv6">
         <w:r>
           <w:rPr>
             <w:color w:val="1D4ED8"/>
@@ -39994,7 +39994,7 @@
         </w:rPr>
         <w:t xml:space="preserve"> </w:t>
       </w:r>
-      <w:hyperlink w:history="1" r:id="rId33g36uwpi0jzk5yopbwn3">
+      <w:hyperlink w:history="1" r:id="rIdrwcmyo7nklz0np4hwnlbb">
         <w:r>
           <w:rPr>
             <w:color w:val="1D4ED8"/>
@@ -40055,7 +40055,7 @@
         </w:rPr>
         <w:t xml:space="preserve"> </w:t>
       </w:r>
-      <w:hyperlink w:history="1" r:id="rId6ov7xcsr6t7qzxirbvnz0">
+      <w:hyperlink w:history="1" r:id="rIdwwgspysqjj6hhrw7fia-x">
         <w:r>
           <w:rPr>
             <w:color w:val="1D4ED8"/>
@@ -40116,7 +40116,7 @@
         </w:rPr>
         <w:t xml:space="preserve"> </w:t>
       </w:r>
-      <w:hyperlink w:history="1" r:id="rIdtwk2zdll-qjqkndnuihtk">
+      <w:hyperlink w:history="1" r:id="rId4nwbwag5aiyfoumbpm6rq">
         <w:r>
           <w:rPr>
             <w:color w:val="1D4ED8"/>
@@ -40177,7 +40177,7 @@
         </w:rPr>
         <w:t xml:space="preserve"> </w:t>
       </w:r>
-      <w:hyperlink w:history="1" r:id="rIdz352vazdmvl7xtanntzfd">
+      <w:hyperlink w:history="1" r:id="rIdhmkraow4zmlrxsncgulda">
         <w:r>
           <w:rPr>
             <w:color w:val="1D4ED8"/>
@@ -40238,7 +40238,7 @@
         </w:rPr>
         <w:t xml:space="preserve"> </w:t>
       </w:r>
-      <w:hyperlink w:history="1" r:id="rIdoehvecb2rc_mdenw-blnw">
+      <w:hyperlink w:history="1" r:id="rIdnnkxj9et1ssr07akq23yg">
         <w:r>
           <w:rPr>
             <w:color w:val="1D4ED8"/>
@@ -40299,7 +40299,7 @@
         </w:rPr>
         <w:t xml:space="preserve"> </w:t>
       </w:r>
-      <w:hyperlink w:history="1" r:id="rId8yvqlj6ttola5mmajncki">
+      <w:hyperlink w:history="1" r:id="rIds9ndkmllwbud9ltu5tizj">
         <w:r>
           <w:rPr>
             <w:color w:val="1D4ED8"/>
@@ -40360,7 +40360,7 @@
         </w:rPr>
         <w:t xml:space="preserve"> </w:t>
       </w:r>
-      <w:hyperlink w:history="1" r:id="rIdpyzvqreiu4oj511ajt4wv">
+      <w:hyperlink w:history="1" r:id="rIdtceschljnfb3wlbswb2zg">
         <w:r>
           <w:rPr>
             <w:color w:val="1D4ED8"/>
@@ -40421,7 +40421,7 @@
         </w:rPr>
         <w:t xml:space="preserve"> </w:t>
       </w:r>
-      <w:hyperlink w:history="1" r:id="rId2fpkqwaexhu_07th4jv8-">
+      <w:hyperlink w:history="1" r:id="rIdcbgk6qi6_ezdck2takics">
         <w:r>
           <w:rPr>
             <w:color w:val="1D4ED8"/>
@@ -40493,7 +40493,7 @@
         </w:rPr>
         <w:t xml:space="preserve"> </w:t>
       </w:r>
-      <w:hyperlink w:history="1" r:id="rId3_2peuujigqjemfzyj9gy">
+      <w:hyperlink w:history="1" r:id="rIdvoooe1dbvp2apu5_qz7tb">
         <w:r>
           <w:rPr>
             <w:color w:val="1D4ED8"/>
@@ -40554,7 +40554,7 @@
         </w:rPr>
         <w:t xml:space="preserve"> </w:t>
       </w:r>
-      <w:hyperlink w:history="1" r:id="rIdhj8y8rex9cgbh38w85xqu">
+      <w:hyperlink w:history="1" r:id="rIdcuem2rjiokaodd4j5api3">
         <w:r>
           <w:rPr>
             <w:color w:val="1D4ED8"/>
@@ -40615,7 +40615,7 @@
         </w:rPr>
         <w:t xml:space="preserve"> </w:t>
       </w:r>
-      <w:hyperlink w:history="1" r:id="rIduvvl5akfey3la_iel4gt6">
+      <w:hyperlink w:history="1" r:id="rIdnj2xzzyof7qpyee8nggng">
         <w:r>
           <w:rPr>
             <w:color w:val="1D4ED8"/>
@@ -40676,7 +40676,7 @@
         </w:rPr>
         <w:t xml:space="preserve"> </w:t>
       </w:r>
-      <w:hyperlink w:history="1" r:id="rIdrul-3acedibza-tp5xkz4">
+      <w:hyperlink w:history="1" r:id="rIdrkm3q_pje96jylmdhoyvb">
         <w:r>
           <w:rPr>
             <w:color w:val="1D4ED8"/>
@@ -40737,7 +40737,7 @@
         </w:rPr>
         <w:t xml:space="preserve"> </w:t>
       </w:r>
-      <w:hyperlink w:history="1" r:id="rIddzefp2fnof6nho5dxrhtp">
+      <w:hyperlink w:history="1" r:id="rIdt0vjlbxewq02rzpdizsse">
         <w:r>
           <w:rPr>
             <w:color w:val="1D4ED8"/>
@@ -40798,7 +40798,7 @@
         </w:rPr>
         <w:t xml:space="preserve"> </w:t>
       </w:r>
-      <w:hyperlink w:history="1" r:id="rIdbpvvhqpbbpbiamicclkwi">
+      <w:hyperlink w:history="1" r:id="rIdef-plnc1ygfsaqylz8cjf">
         <w:r>
           <w:rPr>
             <w:color w:val="1D4ED8"/>
@@ -40859,7 +40859,7 @@
         </w:rPr>
         <w:t xml:space="preserve"> </w:t>
       </w:r>
-      <w:hyperlink w:history="1" r:id="rId0rvzh9qlpgeldubu6oqoz">
+      <w:hyperlink w:history="1" r:id="rId5nssaxcw843c0tnqubi83">
         <w:r>
           <w:rPr>
             <w:color w:val="1D4ED8"/>
@@ -40920,7 +40920,7 @@
         </w:rPr>
         <w:t xml:space="preserve"> </w:t>
       </w:r>
-      <w:hyperlink w:history="1" r:id="rIdi39xhiqmpmkrukflyj_jx">
+      <w:hyperlink w:history="1" r:id="rIdhzrewtpgykhq72p97yaw6">
         <w:r>
           <w:rPr>
             <w:color w:val="1D4ED8"/>
@@ -40981,7 +40981,7 @@
         </w:rPr>
         <w:t xml:space="preserve"> </w:t>
       </w:r>
-      <w:hyperlink w:history="1" r:id="rIdyrwzvemud7zarqlsnvpff">
+      <w:hyperlink w:history="1" r:id="rId8svheuybf6xqqa5gt6qst">
         <w:r>
           <w:rPr>
             <w:color w:val="1D4ED8"/>
@@ -41042,7 +41042,7 @@
         </w:rPr>
         <w:t xml:space="preserve"> </w:t>
       </w:r>
-      <w:hyperlink w:history="1" r:id="rId2v-c0nqbbs1be2o3cxdir">
+      <w:hyperlink w:history="1" r:id="rIdhemevfrrrnwxpzntxedyg">
         <w:r>
           <w:rPr>
             <w:color w:val="1D4ED8"/>
@@ -41103,7 +41103,7 @@
         </w:rPr>
         <w:t xml:space="preserve"> </w:t>
       </w:r>
-      <w:hyperlink w:history="1" r:id="rId8huocwikppiyo9ab1fn8d">
+      <w:hyperlink w:history="1" r:id="rIduea6mrhgnkgcu0fg5lyte">
         <w:r>
           <w:rPr>
             <w:color w:val="1D4ED8"/>
@@ -41164,7 +41164,7 @@
         </w:rPr>
         <w:t xml:space="preserve"> </w:t>
       </w:r>
-      <w:hyperlink w:history="1" r:id="rIdmlgcumk54svd5be-uemw2">
+      <w:hyperlink w:history="1" r:id="rIdoa-rnuv7gnrfew6fpfehh">
         <w:r>
           <w:rPr>
             <w:color w:val="1D4ED8"/>
@@ -41225,7 +41225,7 @@
         </w:rPr>
         <w:t xml:space="preserve"> </w:t>
       </w:r>
-      <w:hyperlink w:history="1" r:id="rIdaq_seoptu-cgil-352m7j">
+      <w:hyperlink w:history="1" r:id="rIdohuaszhbwvq1_wbciibvp">
         <w:r>
           <w:rPr>
             <w:color w:val="1D4ED8"/>
@@ -41286,7 +41286,7 @@
         </w:rPr>
         <w:t xml:space="preserve"> </w:t>
       </w:r>
-      <w:hyperlink w:history="1" r:id="rIddpejoksgxxykkm7e_ohb3">
+      <w:hyperlink w:history="1" r:id="rId9y6rfx-skmek9k5nrfqru">
         <w:r>
           <w:rPr>
             <w:color w:val="1D4ED8"/>
@@ -41347,7 +41347,7 @@
         </w:rPr>
         <w:t xml:space="preserve"> </w:t>
       </w:r>
-      <w:hyperlink w:history="1" r:id="rIdh1ge4-udfc6kve4-yhmyg">
+      <w:hyperlink w:history="1" r:id="rIdmjtrgjaweeef7oqrva9bk">
         <w:r>
           <w:rPr>
             <w:color w:val="1D4ED8"/>
@@ -41408,7 +41408,7 @@
         </w:rPr>
         <w:t xml:space="preserve"> </w:t>
       </w:r>
-      <w:hyperlink w:history="1" r:id="rIdpqee1yiqotwjzlkwgoxf_">
+      <w:hyperlink w:history="1" r:id="rId66gzalj3ozaed7dgkuvrb">
         <w:r>
           <w:rPr>
             <w:color w:val="1D4ED8"/>
@@ -41469,7 +41469,7 @@
         </w:rPr>
         <w:t xml:space="preserve"> </w:t>
       </w:r>
-      <w:hyperlink w:history="1" r:id="rIdvm4knv_dk6xvvbuq-xdz_">
+      <w:hyperlink w:history="1" r:id="rIdwwvjrtioug0ahustcjaps">
         <w:r>
           <w:rPr>
             <w:color w:val="1D4ED8"/>
@@ -41530,7 +41530,7 @@
         </w:rPr>
         <w:t xml:space="preserve"> </w:t>
       </w:r>
-      <w:hyperlink w:history="1" r:id="rIdetd8n0ft2jzc5jd2n8oof">
+      <w:hyperlink w:history="1" r:id="rId3eo4bjjwismmueiqz89ub">
         <w:r>
           <w:rPr>
             <w:color w:val="1D4ED8"/>
@@ -41591,7 +41591,7 @@
         </w:rPr>
         <w:t xml:space="preserve"> </w:t>
       </w:r>
-      <w:hyperlink w:history="1" r:id="rIdd4evi3xkmrs8vc69kn7p4">
+      <w:hyperlink w:history="1" r:id="rIdviauydsnfhtx63tznpzbb">
         <w:r>
           <w:rPr>
             <w:color w:val="1D4ED8"/>
@@ -41652,7 +41652,7 @@
         </w:rPr>
         <w:t xml:space="preserve"> </w:t>
       </w:r>
-      <w:hyperlink w:history="1" r:id="rId5kkodptsr6ajvg2r5qsi2">
+      <w:hyperlink w:history="1" r:id="rId_vt00vjfkhrwlpzbg_9zp">
         <w:r>
           <w:rPr>
             <w:color w:val="1D4ED8"/>
@@ -41681,7 +41681,7 @@
           <w:sz w:val="18"/>
           <w:szCs w:val="18"/>
         </w:rPr>
-        <w:t xml:space="preserve">Note on verification: the bibliographic data were checked against the sources listed in the methodology; no full text was opened, so all equations of the papers are representative formulations. Unconfirmed fields: [V3] the journal is inferred from the NGWA copyright line, while the volume, pages and DOI were not found, so the link to the AUB repository record is given; [D1] the DOI was not seen, so the preprint is given; [D4] the DOI is given to the best of our knowledge; [V5] the DOI comes from the USGS repository, but it was not confirmed by a direct search; [G2] the author order after the fifth author comes from the data registry; [G5] the names of the 15 co-authors were not seen; [V1] the issue number; [N1] the pages. The affiliations are partly confirmed. The DOIs of the base literature B1–B14 are given to the best of our knowledge. The numbers of the innovation come from the numerical tests run for this document.</w:t>
+        <w:t xml:space="preserve">Note on verification: the bibliographic data were checked against the sources listed in the methodology; no full text was opened, so all equations of the papers are representative formulations. Unconfirmed fields: [V3] the journal is inferred from the NGWA copyright line, while the volume, pages and DOI were not found, so the link to the AUB repository record is given; [D1] the DOI was not seen, so the preprint is given; [D4] the DOI is given to the best of our knowledge; [V5] the DOI comes from the USGS repository, but it was not confirmed by a direct search; [G2] the author order after the fifth author comes from the data registry; [G5] the names of the 15 co-authors were not seen; [V1] the issue number; [N1] the pages. The affiliations are partly confirmed. The DOIs of the base literature B1–B14 are given to the best of our knowledge. The numbers in the innovation section come from the numerical tests run for this document.</w:t>
       </w:r>
     </w:p>
     <w:sectPr>

</xml_diff>

<commit_message>
Review 15 (goal-oriented OED): render K_d as math in the sources table
Co-Authored-By: Claude Opus 5.5 <noreply@anthropic.com>
Claude-Session: https://claude.ai/code/session_016Cdcj2FTAQGBVsJUyYJR2M
</commit_message>
<xml_diff>
--- a/docs/literature/Literature_review_Goal-Oriented_OED_Coastal_Aquifers.docx
+++ b/docs/literature/Literature_review_Goal-Oriented_OED_Coastal_Aquifers.docx
@@ -8456,7 +8456,7 @@
             <w:vAlign w:val="top"/>
           </w:tcPr>
           <w:p>
-            <w:hyperlink w:history="1" r:id="rIda3vfc8wpkomu2w1uo0kk_">
+            <w:hyperlink w:history="1" r:id="rIdq2vnp56jypb5wmtkrla-l">
               <w:r>
                 <w:rPr>
                   <w:color w:val="1D4ED8"/>
@@ -9790,7 +9790,7 @@
             <w:vAlign w:val="top"/>
           </w:tcPr>
           <w:p>
-            <w:hyperlink w:history="1" r:id="rIdxqiqf5o5blqdl4ayxibvr">
+            <w:hyperlink w:history="1" r:id="rIdcwzczfp4dmzb-3bi7xnn4">
               <w:r>
                 <w:rPr>
                   <w:color w:val="1D4ED8"/>
@@ -10988,7 +10988,7 @@
             <w:vAlign w:val="top"/>
           </w:tcPr>
           <w:p>
-            <w:hyperlink w:history="1" r:id="rIddf_vnkjgwcqqi2wgl9vdt">
+            <w:hyperlink w:history="1" r:id="rIdeneij7324zd0atxo6bhp8">
               <w:r>
                 <w:rPr>
                   <w:color w:val="1D4ED8"/>
@@ -12232,7 +12232,7 @@
             <w:vAlign w:val="top"/>
           </w:tcPr>
           <w:p>
-            <w:hyperlink w:history="1" r:id="rIdyenkd8qclw3zxmq-jhana">
+            <w:hyperlink w:history="1" r:id="rId2kndkgtgi9tkvmdl5u_tk">
               <w:r>
                 <w:rPr>
                   <w:color w:val="1D4ED8"/>
@@ -13163,7 +13163,7 @@
             <w:vAlign w:val="top"/>
           </w:tcPr>
           <w:p>
-            <w:hyperlink w:history="1" r:id="rIddiyp_x6vetox81fprszcb">
+            <w:hyperlink w:history="1" r:id="rId0qjfnnckggmjzmlkgikxw">
               <w:r>
                 <w:rPr>
                   <w:color w:val="1D4ED8"/>
@@ -14204,7 +14204,7 @@
             <w:vAlign w:val="top"/>
           </w:tcPr>
           <w:p>
-            <w:hyperlink w:history="1" r:id="rIddalldfzbwrrxo3mavfeow">
+            <w:hyperlink w:history="1" r:id="rIdwkuhsduw0vh2cxsizzafv">
               <w:r>
                 <w:rPr>
                   <w:color w:val="1D4ED8"/>
@@ -15587,7 +15587,7 @@
             <w:vAlign w:val="top"/>
           </w:tcPr>
           <w:p>
-            <w:hyperlink w:history="1" r:id="rId6zx5khq7ftmgc_oyqk39w">
+            <w:hyperlink w:history="1" r:id="rIdw3ct1paswveyfmcszkug2">
               <w:r>
                 <w:rPr>
                   <w:color w:val="1D4ED8"/>
@@ -16819,7 +16819,7 @@
             <w:vAlign w:val="top"/>
           </w:tcPr>
           <w:p>
-            <w:hyperlink w:history="1" r:id="rIdma4uec01skftd-jpejxly">
+            <w:hyperlink w:history="1" r:id="rIdhxbets11u_aixfwfcvp9x">
               <w:r>
                 <w:rPr>
                   <w:color w:val="1D4ED8"/>
@@ -18355,7 +18355,7 @@
             <w:vAlign w:val="top"/>
           </w:tcPr>
           <w:p>
-            <w:hyperlink w:history="1" r:id="rIdsabsi9zqhefrvdb1vrzyq">
+            <w:hyperlink w:history="1" r:id="rIdxyjfypw9om2b_v9w0r3ei">
               <w:r>
                 <w:rPr>
                   <w:color w:val="1D4ED8"/>
@@ -19555,7 +19555,7 @@
             <w:vAlign w:val="top"/>
           </w:tcPr>
           <w:p>
-            <w:hyperlink w:history="1" r:id="rIdfuklzsvcqk4dz2dc72l_f">
+            <w:hyperlink w:history="1" r:id="rIdpqud9atyevfuhribd8ope">
               <w:r>
                 <w:rPr>
                   <w:color w:val="1D4ED8"/>
@@ -20776,7 +20776,7 @@
             <w:vAlign w:val="top"/>
           </w:tcPr>
           <w:p>
-            <w:hyperlink w:history="1" r:id="rIdnh7f3kcf0myvzwdhd3hd0">
+            <w:hyperlink w:history="1" r:id="rIdsimqnurcgagl0n3whv_yx">
               <w:r>
                 <w:rPr>
                   <w:color w:val="1D4ED8"/>
@@ -22139,7 +22139,7 @@
             <w:vAlign w:val="top"/>
           </w:tcPr>
           <w:p>
-            <w:hyperlink w:history="1" r:id="rIdtarcubmhrpgtnwrbqqrhn">
+            <w:hyperlink w:history="1" r:id="rIduojtoiv8tkfmys4bw58cn">
               <w:r>
                 <w:rPr>
                   <w:color w:val="1D4ED8"/>
@@ -23443,7 +23443,7 @@
             <w:vAlign w:val="top"/>
           </w:tcPr>
           <w:p>
-            <w:hyperlink w:history="1" r:id="rIdnkofazz1bq9iyysklgojl">
+            <w:hyperlink w:history="1" r:id="rIdudjmt4shxawqt4fzcgwhm">
               <w:r>
                 <w:rPr>
                   <w:color w:val="1D4ED8"/>
@@ -24624,7 +24624,7 @@
             <w:vAlign w:val="top"/>
           </w:tcPr>
           <w:p>
-            <w:hyperlink w:history="1" r:id="rIdgah3cyp0bfwgmlsgb89mr">
+            <w:hyperlink w:history="1" r:id="rId1q_jc7__savwxgawkcbd9">
               <w:r>
                 <w:rPr>
                   <w:color w:val="1D4ED8"/>
@@ -26195,7 +26195,7 @@
             <w:vAlign w:val="top"/>
           </w:tcPr>
           <w:p>
-            <w:hyperlink w:history="1" r:id="rIdsnwtri1taizs9qo59wrsa">
+            <w:hyperlink w:history="1" r:id="rId0qwoihjskjj6cvf4_rndz">
               <w:r>
                 <w:rPr>
                   <w:color w:val="1D4ED8"/>
@@ -27637,7 +27637,7 @@
             <w:vAlign w:val="top"/>
           </w:tcPr>
           <w:p>
-            <w:hyperlink w:history="1" r:id="rId8jncagi4uuy4os42gvgvd">
+            <w:hyperlink w:history="1" r:id="rIdrmpphng4g1ylkcmrupfoj">
               <w:r>
                 <w:rPr>
                   <w:color w:val="1D4ED8"/>
@@ -29036,7 +29036,7 @@
             <w:vAlign w:val="top"/>
           </w:tcPr>
           <w:p>
-            <w:hyperlink w:history="1" r:id="rIdnhut6cujr6zrse6grzyla">
+            <w:hyperlink w:history="1" r:id="rIdu-r8bflvigwcg3n5lc6lj">
               <w:r>
                 <w:rPr>
                   <w:color w:val="1D4ED8"/>
@@ -30040,7 +30040,7 @@
             <w:vAlign w:val="top"/>
           </w:tcPr>
           <w:p>
-            <w:hyperlink w:history="1" r:id="rIduqd3o576zb4maqujyx7qz">
+            <w:hyperlink w:history="1" r:id="rId76ai3pg_hkqhuihxv_4ht">
               <w:r>
                 <w:rPr>
                   <w:color w:val="1D4ED8"/>
@@ -31179,7 +31179,7 @@
             <w:vAlign w:val="top"/>
           </w:tcPr>
           <w:p>
-            <w:hyperlink w:history="1" r:id="rIdqviid9dy3leoiqt_oz4m0">
+            <w:hyperlink w:history="1" r:id="rIdrb8xun9c1vsyqftpq23xb">
               <w:r>
                 <w:rPr>
                   <w:color w:val="1D4ED8"/>
@@ -32220,7 +32220,7 @@
             <w:vAlign w:val="top"/>
           </w:tcPr>
           <w:p>
-            <w:hyperlink w:history="1" r:id="rIdrd8josh5khtngfr9mgua8">
+            <w:hyperlink w:history="1" r:id="rId4brtafs1tjiji1iiavctm">
               <w:r>
                 <w:rPr>
                   <w:color w:val="1D4ED8"/>
@@ -35511,7 +35511,7 @@
               </w:rPr>
               <w:t xml:space="preserve">, 46. </w:t>
             </w:r>
-            <w:hyperlink w:history="1" r:id="rIdnjjgbi7gvsoowcel8yoej">
+            <w:hyperlink w:history="1" r:id="rIdpaeoh_5cavm87vqtnayak">
               <w:r>
                 <w:rPr>
                   <w:color w:val="1D4ED8"/>
@@ -35608,7 +35608,7 @@
               </w:rPr>
               <w:t xml:space="preserve">, 50(8), 6828–6849. </w:t>
             </w:r>
-            <w:hyperlink w:history="1" r:id="rId5-qmm07sfrtj8hjch9mlg">
+            <w:hyperlink w:history="1" r:id="rIdr3md_z7vmjvdmelgbfile">
               <w:r>
                 <w:rPr>
                   <w:color w:val="1D4ED8"/>
@@ -35704,7 +35704,7 @@
               </w:rPr>
               <w:t xml:space="preserve">, 146(6). </w:t>
             </w:r>
-            <w:hyperlink w:history="1" r:id="rIdkqhisplgvvtfaychsqlz6">
+            <w:hyperlink w:history="1" r:id="rIdjdscoafiy7fixgj4onc7a">
               <w:r>
                 <w:rPr>
                   <w:color w:val="1D4ED8"/>
@@ -39225,8 +39225,22 @@
                 <w:sz w:val="16"/>
                 <w:szCs w:val="16"/>
               </w:rPr>
-              <w:t xml:space="preserve">The moments K_d</w:t>
-            </w:r>
+              <w:t xml:space="preserve">The moments </w:t>
+            </w:r>
+            <m:oMath>
+              <m:sSub>
+                <m:e>
+                  <m:r>
+                    <m:t>K</m:t>
+                  </m:r>
+                </m:e>
+                <m:sub>
+                  <m:r>
+                    <m:t>d</m:t>
+                  </m:r>
+                </m:sub>
+              </m:sSub>
+            </m:oMath>
           </w:p>
         </w:tc>
         <w:tc>
@@ -39628,7 +39642,7 @@
         </w:rPr>
         <w:t xml:space="preserve"> </w:t>
       </w:r>
-      <w:hyperlink w:history="1" r:id="rIdkh-_ul06c0zirrwu0nu0h">
+      <w:hyperlink w:history="1" r:id="rId1x1tzp_a3bzj0ws6r9gbq">
         <w:r>
           <w:rPr>
             <w:color w:val="1D4ED8"/>
@@ -39689,7 +39703,7 @@
         </w:rPr>
         <w:t xml:space="preserve"> </w:t>
       </w:r>
-      <w:hyperlink w:history="1" r:id="rIdkol0-wyirneuihvuk7mpp">
+      <w:hyperlink w:history="1" r:id="rIdugvupdks-4occ21d8haac">
         <w:r>
           <w:rPr>
             <w:color w:val="1D4ED8"/>
@@ -39750,7 +39764,7 @@
         </w:rPr>
         <w:t xml:space="preserve"> </w:t>
       </w:r>
-      <w:hyperlink w:history="1" r:id="rId6zzcshbea9hgpsoplrotc">
+      <w:hyperlink w:history="1" r:id="rIdpxfvmw1dhbx7h1apwt7xk">
         <w:r>
           <w:rPr>
             <w:color w:val="1D4ED8"/>
@@ -39811,7 +39825,7 @@
         </w:rPr>
         <w:t xml:space="preserve"> </w:t>
       </w:r>
-      <w:hyperlink w:history="1" r:id="rIdtooz2irdwa9jx0c1mtcnw">
+      <w:hyperlink w:history="1" r:id="rId9qaawem43vguzi3jf6ad5">
         <w:r>
           <w:rPr>
             <w:color w:val="1D4ED8"/>
@@ -39872,7 +39886,7 @@
         </w:rPr>
         <w:t xml:space="preserve"> </w:t>
       </w:r>
-      <w:hyperlink w:history="1" r:id="rIdgvfb9trxwap0v52tnjaia">
+      <w:hyperlink w:history="1" r:id="rIdfk3avadpsgjeetclxytiu">
         <w:r>
           <w:rPr>
             <w:color w:val="1D4ED8"/>
@@ -39933,7 +39947,7 @@
         </w:rPr>
         <w:t xml:space="preserve"> </w:t>
       </w:r>
-      <w:hyperlink w:history="1" r:id="rIdb5zig8h-2ndnxlfct5cv6">
+      <w:hyperlink w:history="1" r:id="rIdrstedzzm5i2i8umbj6itm">
         <w:r>
           <w:rPr>
             <w:color w:val="1D4ED8"/>
@@ -39994,7 +40008,7 @@
         </w:rPr>
         <w:t xml:space="preserve"> </w:t>
       </w:r>
-      <w:hyperlink w:history="1" r:id="rIdrwcmyo7nklz0np4hwnlbb">
+      <w:hyperlink w:history="1" r:id="rIdcijavrhyu-ngor2hct7_4">
         <w:r>
           <w:rPr>
             <w:color w:val="1D4ED8"/>
@@ -40055,7 +40069,7 @@
         </w:rPr>
         <w:t xml:space="preserve"> </w:t>
       </w:r>
-      <w:hyperlink w:history="1" r:id="rIdwwgspysqjj6hhrw7fia-x">
+      <w:hyperlink w:history="1" r:id="rIdwz1q6aii6pxpgkt4a7s8n">
         <w:r>
           <w:rPr>
             <w:color w:val="1D4ED8"/>
@@ -40116,7 +40130,7 @@
         </w:rPr>
         <w:t xml:space="preserve"> </w:t>
       </w:r>
-      <w:hyperlink w:history="1" r:id="rId4nwbwag5aiyfoumbpm6rq">
+      <w:hyperlink w:history="1" r:id="rIdfv2mvoz6s0yxdafmnup2e">
         <w:r>
           <w:rPr>
             <w:color w:val="1D4ED8"/>
@@ -40177,7 +40191,7 @@
         </w:rPr>
         <w:t xml:space="preserve"> </w:t>
       </w:r>
-      <w:hyperlink w:history="1" r:id="rIdhmkraow4zmlrxsncgulda">
+      <w:hyperlink w:history="1" r:id="rIdpmhcxexjbubzhsgaei1nf">
         <w:r>
           <w:rPr>
             <w:color w:val="1D4ED8"/>
@@ -40238,7 +40252,7 @@
         </w:rPr>
         <w:t xml:space="preserve"> </w:t>
       </w:r>
-      <w:hyperlink w:history="1" r:id="rIdnnkxj9et1ssr07akq23yg">
+      <w:hyperlink w:history="1" r:id="rId-0ll1xfp53o6uruvvus5p">
         <w:r>
           <w:rPr>
             <w:color w:val="1D4ED8"/>
@@ -40299,7 +40313,7 @@
         </w:rPr>
         <w:t xml:space="preserve"> </w:t>
       </w:r>
-      <w:hyperlink w:history="1" r:id="rIds9ndkmllwbud9ltu5tizj">
+      <w:hyperlink w:history="1" r:id="rIdbjj7ss5yg-n18ft9fuf87">
         <w:r>
           <w:rPr>
             <w:color w:val="1D4ED8"/>
@@ -40360,7 +40374,7 @@
         </w:rPr>
         <w:t xml:space="preserve"> </w:t>
       </w:r>
-      <w:hyperlink w:history="1" r:id="rIdtceschljnfb3wlbswb2zg">
+      <w:hyperlink w:history="1" r:id="rIdp6h4kdl5glkum72gvgnxt">
         <w:r>
           <w:rPr>
             <w:color w:val="1D4ED8"/>
@@ -40421,7 +40435,7 @@
         </w:rPr>
         <w:t xml:space="preserve"> </w:t>
       </w:r>
-      <w:hyperlink w:history="1" r:id="rIdcbgk6qi6_ezdck2takics">
+      <w:hyperlink w:history="1" r:id="rIdfc_ja6t7ujxyl96cefsot">
         <w:r>
           <w:rPr>
             <w:color w:val="1D4ED8"/>
@@ -40493,7 +40507,7 @@
         </w:rPr>
         <w:t xml:space="preserve"> </w:t>
       </w:r>
-      <w:hyperlink w:history="1" r:id="rIdvoooe1dbvp2apu5_qz7tb">
+      <w:hyperlink w:history="1" r:id="rId-tfgjob-swbaicgn7r3fb">
         <w:r>
           <w:rPr>
             <w:color w:val="1D4ED8"/>
@@ -40554,7 +40568,7 @@
         </w:rPr>
         <w:t xml:space="preserve"> </w:t>
       </w:r>
-      <w:hyperlink w:history="1" r:id="rIdcuem2rjiokaodd4j5api3">
+      <w:hyperlink w:history="1" r:id="rIdzktib6fbzabzahftvdw-w">
         <w:r>
           <w:rPr>
             <w:color w:val="1D4ED8"/>
@@ -40615,7 +40629,7 @@
         </w:rPr>
         <w:t xml:space="preserve"> </w:t>
       </w:r>
-      <w:hyperlink w:history="1" r:id="rIdnj2xzzyof7qpyee8nggng">
+      <w:hyperlink w:history="1" r:id="rIdlbbu4d8hngtyu6fk__dwv">
         <w:r>
           <w:rPr>
             <w:color w:val="1D4ED8"/>
@@ -40676,7 +40690,7 @@
         </w:rPr>
         <w:t xml:space="preserve"> </w:t>
       </w:r>
-      <w:hyperlink w:history="1" r:id="rIdrkm3q_pje96jylmdhoyvb">
+      <w:hyperlink w:history="1" r:id="rIdbcwyesajysijvfqllzl00">
         <w:r>
           <w:rPr>
             <w:color w:val="1D4ED8"/>
@@ -40737,7 +40751,7 @@
         </w:rPr>
         <w:t xml:space="preserve"> </w:t>
       </w:r>
-      <w:hyperlink w:history="1" r:id="rIdt0vjlbxewq02rzpdizsse">
+      <w:hyperlink w:history="1" r:id="rId2wksqzmbezcr2hlpx3fkl">
         <w:r>
           <w:rPr>
             <w:color w:val="1D4ED8"/>
@@ -40798,7 +40812,7 @@
         </w:rPr>
         <w:t xml:space="preserve"> </w:t>
       </w:r>
-      <w:hyperlink w:history="1" r:id="rIdef-plnc1ygfsaqylz8cjf">
+      <w:hyperlink w:history="1" r:id="rIdospfyntubpm6amphtjsna">
         <w:r>
           <w:rPr>
             <w:color w:val="1D4ED8"/>
@@ -40859,7 +40873,7 @@
         </w:rPr>
         <w:t xml:space="preserve"> </w:t>
       </w:r>
-      <w:hyperlink w:history="1" r:id="rId5nssaxcw843c0tnqubi83">
+      <w:hyperlink w:history="1" r:id="rIdgs8igazjodtuqbdshanri">
         <w:r>
           <w:rPr>
             <w:color w:val="1D4ED8"/>
@@ -40920,7 +40934,7 @@
         </w:rPr>
         <w:t xml:space="preserve"> </w:t>
       </w:r>
-      <w:hyperlink w:history="1" r:id="rIdhzrewtpgykhq72p97yaw6">
+      <w:hyperlink w:history="1" r:id="rIdj_dglb2kqmkcdjehfglfu">
         <w:r>
           <w:rPr>
             <w:color w:val="1D4ED8"/>
@@ -40981,7 +40995,7 @@
         </w:rPr>
         <w:t xml:space="preserve"> </w:t>
       </w:r>
-      <w:hyperlink w:history="1" r:id="rId8svheuybf6xqqa5gt6qst">
+      <w:hyperlink w:history="1" r:id="rIdkdhkii1dnxuri5uwm_ssn">
         <w:r>
           <w:rPr>
             <w:color w:val="1D4ED8"/>
@@ -41042,7 +41056,7 @@
         </w:rPr>
         <w:t xml:space="preserve"> </w:t>
       </w:r>
-      <w:hyperlink w:history="1" r:id="rIdhemevfrrrnwxpzntxedyg">
+      <w:hyperlink w:history="1" r:id="rIdv-3hkziagj-g5oygjnbqv">
         <w:r>
           <w:rPr>
             <w:color w:val="1D4ED8"/>
@@ -41103,7 +41117,7 @@
         </w:rPr>
         <w:t xml:space="preserve"> </w:t>
       </w:r>
-      <w:hyperlink w:history="1" r:id="rIduea6mrhgnkgcu0fg5lyte">
+      <w:hyperlink w:history="1" r:id="rIdt5bzyify1vc9uljcjwilh">
         <w:r>
           <w:rPr>
             <w:color w:val="1D4ED8"/>
@@ -41164,7 +41178,7 @@
         </w:rPr>
         <w:t xml:space="preserve"> </w:t>
       </w:r>
-      <w:hyperlink w:history="1" r:id="rIdoa-rnuv7gnrfew6fpfehh">
+      <w:hyperlink w:history="1" r:id="rIdl-g2w3jpyf1ylh6z89zmd">
         <w:r>
           <w:rPr>
             <w:color w:val="1D4ED8"/>
@@ -41225,7 +41239,7 @@
         </w:rPr>
         <w:t xml:space="preserve"> </w:t>
       </w:r>
-      <w:hyperlink w:history="1" r:id="rIdohuaszhbwvq1_wbciibvp">
+      <w:hyperlink w:history="1" r:id="rIdu7qz3q8tszkdpjvnhqfya">
         <w:r>
           <w:rPr>
             <w:color w:val="1D4ED8"/>
@@ -41286,7 +41300,7 @@
         </w:rPr>
         <w:t xml:space="preserve"> </w:t>
       </w:r>
-      <w:hyperlink w:history="1" r:id="rId9y6rfx-skmek9k5nrfqru">
+      <w:hyperlink w:history="1" r:id="rIdycmeaq7tilvwzznmrmayr">
         <w:r>
           <w:rPr>
             <w:color w:val="1D4ED8"/>
@@ -41347,7 +41361,7 @@
         </w:rPr>
         <w:t xml:space="preserve"> </w:t>
       </w:r>
-      <w:hyperlink w:history="1" r:id="rIdmjtrgjaweeef7oqrva9bk">
+      <w:hyperlink w:history="1" r:id="rIddksq03m2-y5nzuhyecsqq">
         <w:r>
           <w:rPr>
             <w:color w:val="1D4ED8"/>
@@ -41408,7 +41422,7 @@
         </w:rPr>
         <w:t xml:space="preserve"> </w:t>
       </w:r>
-      <w:hyperlink w:history="1" r:id="rId66gzalj3ozaed7dgkuvrb">
+      <w:hyperlink w:history="1" r:id="rIdva1zl5ok3b73unlxlwujz">
         <w:r>
           <w:rPr>
             <w:color w:val="1D4ED8"/>
@@ -41469,7 +41483,7 @@
         </w:rPr>
         <w:t xml:space="preserve"> </w:t>
       </w:r>
-      <w:hyperlink w:history="1" r:id="rIdwwvjrtioug0ahustcjaps">
+      <w:hyperlink w:history="1" r:id="rIdva-iuqblwq7m5icuiqe71">
         <w:r>
           <w:rPr>
             <w:color w:val="1D4ED8"/>
@@ -41530,7 +41544,7 @@
         </w:rPr>
         <w:t xml:space="preserve"> </w:t>
       </w:r>
-      <w:hyperlink w:history="1" r:id="rId3eo4bjjwismmueiqz89ub">
+      <w:hyperlink w:history="1" r:id="rIdghz5hcr_-haif46hmjqlw">
         <w:r>
           <w:rPr>
             <w:color w:val="1D4ED8"/>
@@ -41591,7 +41605,7 @@
         </w:rPr>
         <w:t xml:space="preserve"> </w:t>
       </w:r>
-      <w:hyperlink w:history="1" r:id="rIdviauydsnfhtx63tznpzbb">
+      <w:hyperlink w:history="1" r:id="rIdz8eo_gtut5s2y-zk5mvco">
         <w:r>
           <w:rPr>
             <w:color w:val="1D4ED8"/>
@@ -41652,7 +41666,7 @@
         </w:rPr>
         <w:t xml:space="preserve"> </w:t>
       </w:r>
-      <w:hyperlink w:history="1" r:id="rId_vt00vjfkhrwlpzbg_9zp">
+      <w:hyperlink w:history="1" r:id="rIdwxajzgiawymzu-6evjwcx">
         <w:r>
           <w:rPr>
             <w:color w:val="1D4ED8"/>

</xml_diff>